<commit_message>
feat: add worker timesheet generation functionality
- Implement new endpoint '/generate_tabel' to handle timesheet generation
- Add worker data processing logic with support for up to 80 workers
- Modify template to display workers in 4 sections with proper numbering
- Add frontend button and JavaScript for timesheet generation
- Fix template variable name from 'actVem' to 'actV'
</commit_message>
<xml_diff>
--- a/tabel.docx
+++ b/tabel.docx
@@ -338,11 +338,15 @@
                                 <w:p>
                                   <w:pPr>
                                     <w:rPr>
+                                      <w:b/>
+                                      <w:bCs/>
                                       <w:lang w:val="en-US"/>
                                     </w:rPr>
                                   </w:pPr>
                                   <w:r>
                                     <w:rPr>
+                                      <w:b/>
+                                      <w:bCs/>
                                       <w:lang w:val="en-US"/>
                                     </w:rPr>
                                     <w:t>{{</w:t>
@@ -350,6 +354,8 @@
                                   <w:proofErr w:type="spellStart"/>
                                   <w:r>
                                     <w:rPr>
+                                      <w:b/>
+                                      <w:bCs/>
                                       <w:lang w:val="en-US"/>
                                     </w:rPr>
                                     <w:t>checkDeMontazh</w:t>
@@ -357,6 +363,8 @@
                                   <w:proofErr w:type="spellEnd"/>
                                   <w:r>
                                     <w:rPr>
+                                      <w:b/>
+                                      <w:bCs/>
                                       <w:lang w:val="en-US"/>
                                     </w:rPr>
                                     <w:t>}}</w:t>
@@ -384,17 +392,25 @@
                 </mc:Choice>
                 <mc:Fallback>
                   <w:pict>
-                    <v:shape w14:anchorId="0C2D9659" id="Блок-схема: процесс 2" o:spid="_x0000_s1027" type="#_x0000_t109" style="position:absolute;margin-left:82pt;margin-top:13.35pt;width:23.25pt;height:18.75pt;z-index:251661312;visibility:visible;mso-wrap-style:square;mso-width-percent:0;mso-height-percent:0;mso-wrap-distance-left:9pt;mso-wrap-distance-top:0;mso-wrap-distance-right:9pt;mso-wrap-distance-bottom:0;mso-position-horizontal:absolute;mso-position-horizontal-relative:text;mso-position-vertical:absolute;mso-position-vertical-relative:text;mso-width-percent:0;mso-height-percent:0;mso-width-relative:margin;mso-height-relative:margin;v-text-anchor:middle" o:gfxdata="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" fillcolor="white [3201]" strokecolor="black [3200]" strokeweight=".5pt">
+                    <v:shapetype w14:anchorId="0C2D9659" id="_x0000_t109" coordsize="21600,21600" o:spt="109" path="m,l,21600r21600,l21600,xe">
+                      <v:stroke joinstyle="miter"/>
+                      <v:path gradientshapeok="t" o:connecttype="rect"/>
+                    </v:shapetype>
+                    <v:shape id="Блок-схема: процесс 2" o:spid="_x0000_s1027" type="#_x0000_t109" style="position:absolute;margin-left:82pt;margin-top:13.35pt;width:23.25pt;height:18.75pt;z-index:251661312;visibility:visible;mso-wrap-style:square;mso-width-percent:0;mso-height-percent:0;mso-wrap-distance-left:9pt;mso-wrap-distance-top:0;mso-wrap-distance-right:9pt;mso-wrap-distance-bottom:0;mso-position-horizontal:absolute;mso-position-horizontal-relative:text;mso-position-vertical:absolute;mso-position-vertical-relative:text;mso-width-percent:0;mso-height-percent:0;mso-width-relative:margin;mso-height-relative:margin;v-text-anchor:middle" o:gfxdata="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" fillcolor="white [3201]" strokecolor="black [3200]" strokeweight=".5pt">
                       <v:textbox>
                         <w:txbxContent>
                           <w:p>
                             <w:pPr>
                               <w:rPr>
+                                <w:b/>
+                                <w:bCs/>
                                 <w:lang w:val="en-US"/>
                               </w:rPr>
                             </w:pPr>
                             <w:r>
                               <w:rPr>
+                                <w:b/>
+                                <w:bCs/>
                                 <w:lang w:val="en-US"/>
                               </w:rPr>
                               <w:t>{{</w:t>
@@ -402,6 +418,8 @@
                             <w:proofErr w:type="spellStart"/>
                             <w:r>
                               <w:rPr>
+                                <w:b/>
+                                <w:bCs/>
                                 <w:lang w:val="en-US"/>
                               </w:rPr>
                               <w:t>checkDeMontazh</w:t>
@@ -409,6 +427,8 @@
                             <w:proofErr w:type="spellEnd"/>
                             <w:r>
                               <w:rPr>
+                                <w:b/>
+                                <w:bCs/>
                                 <w:lang w:val="en-US"/>
                               </w:rPr>
                               <w:t>}}</w:t>
@@ -477,11 +497,15 @@
                                 <w:p>
                                   <w:pPr>
                                     <w:rPr>
+                                      <w:b/>
+                                      <w:bCs/>
                                       <w:lang w:val="en-US"/>
                                     </w:rPr>
                                   </w:pPr>
                                   <w:r>
                                     <w:rPr>
+                                      <w:b/>
+                                      <w:bCs/>
                                       <w:lang w:val="en-US"/>
                                     </w:rPr>
                                     <w:t>{{</w:t>
@@ -489,6 +513,8 @@
                                   <w:proofErr w:type="spellStart"/>
                                   <w:r>
                                     <w:rPr>
+                                      <w:b/>
+                                      <w:bCs/>
                                       <w:lang w:val="en-US"/>
                                     </w:rPr>
                                     <w:t>checkMontazh</w:t>
@@ -496,6 +522,8 @@
                                   <w:proofErr w:type="spellEnd"/>
                                   <w:r>
                                     <w:rPr>
+                                      <w:b/>
+                                      <w:bCs/>
                                       <w:lang w:val="en-US"/>
                                     </w:rPr>
                                     <w:t>}}</w:t>
@@ -529,11 +557,15 @@
                           <w:p>
                             <w:pPr>
                               <w:rPr>
+                                <w:b/>
+                                <w:bCs/>
                                 <w:lang w:val="en-US"/>
                               </w:rPr>
                             </w:pPr>
                             <w:r>
                               <w:rPr>
+                                <w:b/>
+                                <w:bCs/>
                                 <w:lang w:val="en-US"/>
                               </w:rPr>
                               <w:t>{{</w:t>
@@ -541,6 +573,8 @@
                             <w:proofErr w:type="spellStart"/>
                             <w:r>
                               <w:rPr>
+                                <w:b/>
+                                <w:bCs/>
                                 <w:lang w:val="en-US"/>
                               </w:rPr>
                               <w:t>checkMontazh</w:t>
@@ -548,6 +582,8 @@
                             <w:proofErr w:type="spellEnd"/>
                             <w:r>
                               <w:rPr>
+                                <w:b/>
+                                <w:bCs/>
                                 <w:lang w:val="en-US"/>
                               </w:rPr>
                               <w:t>}}</w:t>
@@ -1084,7 +1120,7 @@
                 <w:b/>
                 <w:bCs/>
                 <w:noProof/>
-                <w:lang w:eastAsia="ru-RU"/>
+                <w:lang w:val="en-US" w:eastAsia="ru-RU"/>
               </w:rPr>
             </w:pPr>
           </w:p>
@@ -1829,7 +1865,7 @@
                 <w:noProof/>
                 <w:lang w:val="en-US" w:eastAsia="ru-RU"/>
               </w:rPr>
-              <w:t xml:space="preserve">{{actVem}}   </w:t>
+              <w:t xml:space="preserve">{{actV}}   </w:t>
             </w:r>
             <w:r>
               <w:rPr>
@@ -2203,218 +2239,10 @@
         <w:spacing w:after="0" w:line="360" w:lineRule="auto"/>
         <w:contextualSpacing/>
         <w:rPr>
+          <w:b/>
           <w:i/>
           <w:noProof/>
-          <w:lang w:val="en-US" w:eastAsia="ru-RU"/>
-        </w:rPr>
-      </w:pPr>
-    </w:p>
-    <w:p>
-      <w:pPr>
-        <w:tabs>
-          <w:tab w:val="left" w:pos="284"/>
-        </w:tabs>
-        <w:spacing w:after="0" w:line="360" w:lineRule="auto"/>
-        <w:contextualSpacing/>
-        <w:rPr>
-          <w:i/>
-          <w:noProof/>
-          <w:lang w:val="en-US" w:eastAsia="ru-RU"/>
-        </w:rPr>
-      </w:pPr>
-    </w:p>
-    <w:p>
-      <w:pPr>
-        <w:tabs>
-          <w:tab w:val="left" w:pos="284"/>
-        </w:tabs>
-        <w:spacing w:after="0" w:line="360" w:lineRule="auto"/>
-        <w:contextualSpacing/>
-        <w:rPr>
-          <w:i/>
-          <w:noProof/>
-          <w:lang w:val="en-US" w:eastAsia="ru-RU"/>
-        </w:rPr>
-      </w:pPr>
-    </w:p>
-    <w:p>
-      <w:pPr>
-        <w:tabs>
-          <w:tab w:val="left" w:pos="284"/>
-        </w:tabs>
-        <w:spacing w:after="0" w:line="360" w:lineRule="auto"/>
-        <w:contextualSpacing/>
-        <w:rPr>
-          <w:i/>
-          <w:noProof/>
-          <w:lang w:val="en-US" w:eastAsia="ru-RU"/>
-        </w:rPr>
-      </w:pPr>
-    </w:p>
-    <w:p>
-      <w:pPr>
-        <w:tabs>
-          <w:tab w:val="left" w:pos="284"/>
-        </w:tabs>
-        <w:spacing w:after="0" w:line="360" w:lineRule="auto"/>
-        <w:contextualSpacing/>
-        <w:rPr>
-          <w:i/>
-          <w:noProof/>
-          <w:lang w:val="en-US" w:eastAsia="ru-RU"/>
-        </w:rPr>
-      </w:pPr>
-    </w:p>
-    <w:p>
-      <w:pPr>
-        <w:tabs>
-          <w:tab w:val="left" w:pos="284"/>
-        </w:tabs>
-        <w:spacing w:after="0" w:line="360" w:lineRule="auto"/>
-        <w:contextualSpacing/>
-        <w:rPr>
-          <w:i/>
-          <w:noProof/>
-          <w:lang w:val="en-US" w:eastAsia="ru-RU"/>
-        </w:rPr>
-      </w:pPr>
-    </w:p>
-    <w:p>
-      <w:pPr>
-        <w:tabs>
-          <w:tab w:val="left" w:pos="284"/>
-        </w:tabs>
-        <w:spacing w:after="0" w:line="360" w:lineRule="auto"/>
-        <w:contextualSpacing/>
-        <w:rPr>
-          <w:i/>
-          <w:noProof/>
-          <w:lang w:val="en-US" w:eastAsia="ru-RU"/>
-        </w:rPr>
-      </w:pPr>
-    </w:p>
-    <w:p>
-      <w:pPr>
-        <w:tabs>
-          <w:tab w:val="left" w:pos="284"/>
-        </w:tabs>
-        <w:spacing w:after="0" w:line="360" w:lineRule="auto"/>
-        <w:contextualSpacing/>
-        <w:rPr>
-          <w:i/>
-          <w:noProof/>
-          <w:lang w:val="en-US" w:eastAsia="ru-RU"/>
-        </w:rPr>
-      </w:pPr>
-    </w:p>
-    <w:p>
-      <w:pPr>
-        <w:tabs>
-          <w:tab w:val="left" w:pos="284"/>
-        </w:tabs>
-        <w:spacing w:after="0" w:line="360" w:lineRule="auto"/>
-        <w:contextualSpacing/>
-        <w:rPr>
-          <w:i/>
-          <w:noProof/>
-          <w:lang w:val="en-US" w:eastAsia="ru-RU"/>
-        </w:rPr>
-      </w:pPr>
-    </w:p>
-    <w:p>
-      <w:pPr>
-        <w:tabs>
-          <w:tab w:val="left" w:pos="284"/>
-        </w:tabs>
-        <w:spacing w:after="0" w:line="360" w:lineRule="auto"/>
-        <w:contextualSpacing/>
-        <w:rPr>
-          <w:i/>
-          <w:noProof/>
-          <w:lang w:val="en-US" w:eastAsia="ru-RU"/>
-        </w:rPr>
-      </w:pPr>
-    </w:p>
-    <w:p>
-      <w:pPr>
-        <w:tabs>
-          <w:tab w:val="left" w:pos="284"/>
-        </w:tabs>
-        <w:spacing w:after="0" w:line="360" w:lineRule="auto"/>
-        <w:contextualSpacing/>
-        <w:rPr>
-          <w:i/>
-          <w:noProof/>
-          <w:lang w:val="en-US" w:eastAsia="ru-RU"/>
-        </w:rPr>
-      </w:pPr>
-    </w:p>
-    <w:p>
-      <w:pPr>
-        <w:tabs>
-          <w:tab w:val="left" w:pos="284"/>
-        </w:tabs>
-        <w:spacing w:after="0" w:line="360" w:lineRule="auto"/>
-        <w:contextualSpacing/>
-        <w:rPr>
-          <w:i/>
-          <w:noProof/>
-          <w:lang w:val="en-US" w:eastAsia="ru-RU"/>
-        </w:rPr>
-      </w:pPr>
-    </w:p>
-    <w:p>
-      <w:pPr>
-        <w:tabs>
-          <w:tab w:val="left" w:pos="284"/>
-        </w:tabs>
-        <w:spacing w:after="0" w:line="360" w:lineRule="auto"/>
-        <w:contextualSpacing/>
-        <w:rPr>
-          <w:i/>
-          <w:noProof/>
-          <w:lang w:val="en-US" w:eastAsia="ru-RU"/>
-        </w:rPr>
-      </w:pPr>
-    </w:p>
-    <w:p>
-      <w:pPr>
-        <w:tabs>
-          <w:tab w:val="left" w:pos="284"/>
-        </w:tabs>
-        <w:spacing w:after="0" w:line="360" w:lineRule="auto"/>
-        <w:contextualSpacing/>
-        <w:rPr>
-          <w:i/>
-          <w:noProof/>
-          <w:lang w:val="en-US" w:eastAsia="ru-RU"/>
-        </w:rPr>
-      </w:pPr>
-    </w:p>
-    <w:p>
-      <w:pPr>
-        <w:tabs>
-          <w:tab w:val="left" w:pos="284"/>
-        </w:tabs>
-        <w:spacing w:after="0" w:line="360" w:lineRule="auto"/>
-        <w:contextualSpacing/>
-        <w:rPr>
-          <w:i/>
-          <w:noProof/>
-          <w:lang w:val="en-US" w:eastAsia="ru-RU"/>
-        </w:rPr>
-      </w:pPr>
-    </w:p>
-    <w:p>
-      <w:pPr>
-        <w:tabs>
-          <w:tab w:val="left" w:pos="284"/>
-        </w:tabs>
-        <w:spacing w:after="0" w:line="360" w:lineRule="auto"/>
-        <w:contextualSpacing/>
-        <w:rPr>
-          <w:i/>
-          <w:noProof/>
+          <w:sz w:val="10"/>
           <w:lang w:val="en-US" w:eastAsia="ru-RU"/>
         </w:rPr>
       </w:pPr>
@@ -2434,43 +2262,6 @@
           <w:lang w:val="en-US" w:eastAsia="ru-RU"/>
         </w:rPr>
       </w:pPr>
-      <w:r>
-        <w:rPr>
-          <w:b/>
-          <w:i/>
-          <w:noProof/>
-          <w:sz w:val="10"/>
-          <w:lang w:eastAsia="ru-RU"/>
-        </w:rPr>
-        <w:tab/>
-      </w:r>
-    </w:p>
-    <w:p>
-      <w:pPr>
-        <w:tabs>
-          <w:tab w:val="left" w:pos="284"/>
-        </w:tabs>
-        <w:spacing w:after="0" w:line="360" w:lineRule="auto"/>
-        <w:contextualSpacing/>
-        <w:rPr>
-          <w:b/>
-          <w:i/>
-          <w:noProof/>
-          <w:sz w:val="10"/>
-          <w:lang w:eastAsia="ru-RU"/>
-        </w:rPr>
-      </w:pPr>
-      <w:r>
-        <w:rPr>
-          <w:b/>
-          <w:i/>
-          <w:noProof/>
-          <w:sz w:val="10"/>
-          <w:lang w:eastAsia="ru-RU"/>
-        </w:rPr>
-        <w:lastRenderedPageBreak/>
-        <w:tab/>
-      </w:r>
     </w:p>
     <w:p>
       <w:pPr>
@@ -2778,11 +2569,15 @@
                                 <w:p>
                                   <w:pPr>
                                     <w:rPr>
+                                      <w:b/>
+                                      <w:bCs/>
                                       <w:lang w:val="en-US"/>
                                     </w:rPr>
                                   </w:pPr>
                                   <w:r>
                                     <w:rPr>
+                                      <w:b/>
+                                      <w:bCs/>
                                       <w:lang w:val="en-US"/>
                                     </w:rPr>
                                     <w:t>{{</w:t>
@@ -2790,6 +2585,8 @@
                                   <w:proofErr w:type="spellStart"/>
                                   <w:r>
                                     <w:rPr>
+                                      <w:b/>
+                                      <w:bCs/>
                                       <w:lang w:val="en-US"/>
                                     </w:rPr>
                                     <w:t>checkDeMontazh</w:t>
@@ -2797,6 +2594,8 @@
                                   <w:proofErr w:type="spellEnd"/>
                                   <w:r>
                                     <w:rPr>
+                                      <w:b/>
+                                      <w:bCs/>
                                       <w:lang w:val="en-US"/>
                                     </w:rPr>
                                     <w:t>}}</w:t>
@@ -2830,11 +2629,15 @@
                           <w:p>
                             <w:pPr>
                               <w:rPr>
+                                <w:b/>
+                                <w:bCs/>
                                 <w:lang w:val="en-US"/>
                               </w:rPr>
                             </w:pPr>
                             <w:r>
                               <w:rPr>
+                                <w:b/>
+                                <w:bCs/>
                                 <w:lang w:val="en-US"/>
                               </w:rPr>
                               <w:t>{{</w:t>
@@ -2842,6 +2645,8 @@
                             <w:proofErr w:type="spellStart"/>
                             <w:r>
                               <w:rPr>
+                                <w:b/>
+                                <w:bCs/>
                                 <w:lang w:val="en-US"/>
                               </w:rPr>
                               <w:t>checkDeMontazh</w:t>
@@ -2849,6 +2654,8 @@
                             <w:proofErr w:type="spellEnd"/>
                             <w:r>
                               <w:rPr>
+                                <w:b/>
+                                <w:bCs/>
                                 <w:lang w:val="en-US"/>
                               </w:rPr>
                               <w:t>}}</w:t>
@@ -2917,11 +2724,15 @@
                                 <w:p>
                                   <w:pPr>
                                     <w:rPr>
+                                      <w:b/>
+                                      <w:bCs/>
                                       <w:lang w:val="en-US"/>
                                     </w:rPr>
                                   </w:pPr>
                                   <w:r>
                                     <w:rPr>
+                                      <w:b/>
+                                      <w:bCs/>
                                       <w:lang w:val="en-US"/>
                                     </w:rPr>
                                     <w:t>{{</w:t>
@@ -2929,6 +2740,8 @@
                                   <w:proofErr w:type="spellStart"/>
                                   <w:r>
                                     <w:rPr>
+                                      <w:b/>
+                                      <w:bCs/>
                                       <w:lang w:val="en-US"/>
                                     </w:rPr>
                                     <w:t>checkMontazh</w:t>
@@ -2936,6 +2749,8 @@
                                   <w:proofErr w:type="spellEnd"/>
                                   <w:r>
                                     <w:rPr>
+                                      <w:b/>
+                                      <w:bCs/>
                                       <w:lang w:val="en-US"/>
                                     </w:rPr>
                                     <w:t>}}</w:t>
@@ -2969,11 +2784,15 @@
                           <w:p>
                             <w:pPr>
                               <w:rPr>
+                                <w:b/>
+                                <w:bCs/>
                                 <w:lang w:val="en-US"/>
                               </w:rPr>
                             </w:pPr>
                             <w:r>
                               <w:rPr>
+                                <w:b/>
+                                <w:bCs/>
                                 <w:lang w:val="en-US"/>
                               </w:rPr>
                               <w:t>{{</w:t>
@@ -2981,6 +2800,8 @@
                             <w:proofErr w:type="spellStart"/>
                             <w:r>
                               <w:rPr>
+                                <w:b/>
+                                <w:bCs/>
                                 <w:lang w:val="en-US"/>
                               </w:rPr>
                               <w:t>checkMontazh</w:t>
@@ -2988,6 +2809,8 @@
                             <w:proofErr w:type="spellEnd"/>
                             <w:r>
                               <w:rPr>
+                                <w:b/>
+                                <w:bCs/>
                                 <w:lang w:val="en-US"/>
                               </w:rPr>
                               <w:t>}}</w:t>
@@ -3556,7 +3379,23 @@
                 <w:noProof/>
                 <w:lang w:val="en-US" w:eastAsia="ru-RU"/>
               </w:rPr>
-              <w:t>{{loop.index}}</w:t>
+              <w:t>{{loop.index</w:t>
+            </w:r>
+            <w:r>
+              <w:rPr>
+                <w:i/>
+                <w:noProof/>
+                <w:lang w:val="en-US" w:eastAsia="ru-RU"/>
+              </w:rPr>
+              <w:t xml:space="preserve"> + 20</w:t>
+            </w:r>
+            <w:r>
+              <w:rPr>
+                <w:i/>
+                <w:noProof/>
+                <w:lang w:val="en-US" w:eastAsia="ru-RU"/>
+              </w:rPr>
+              <w:t>}}</w:t>
             </w:r>
           </w:p>
         </w:tc>
@@ -3830,17 +3669,9 @@
               <w:rPr>
                 <w:i/>
                 <w:noProof/>
-                <w:lang w:eastAsia="ru-RU"/>
-              </w:rPr>
-            </w:pPr>
-            <w:r>
-              <w:rPr>
-                <w:i/>
-                <w:noProof/>
-                <w:lang w:eastAsia="ru-RU"/>
-              </w:rPr>
-              <w:t>Монтажник СЛиП</w:t>
-            </w:r>
+                <w:lang w:val="en-US" w:eastAsia="ru-RU"/>
+              </w:rPr>
+            </w:pPr>
           </w:p>
         </w:tc>
         <w:tc>
@@ -4121,6 +3952,7 @@
                 <w:noProof/>
                 <w:lang w:eastAsia="ru-RU"/>
               </w:rPr>
+              <w:lastRenderedPageBreak/>
               <w:t>Площадь</w:t>
             </w:r>
             <w:r>
@@ -4257,7 +4089,7 @@
                 <w:noProof/>
                 <w:lang w:val="en-US" w:eastAsia="ru-RU"/>
               </w:rPr>
-              <w:t>{{actVem}}   m3</w:t>
+              <w:t>{{actV}}   m3</w:t>
             </w:r>
           </w:p>
         </w:tc>
@@ -4623,219 +4455,11 @@
         <w:spacing w:after="0" w:line="360" w:lineRule="auto"/>
         <w:contextualSpacing/>
         <w:rPr>
+          <w:b/>
           <w:i/>
           <w:noProof/>
-          <w:lang w:eastAsia="ru-RU"/>
-        </w:rPr>
-      </w:pPr>
-    </w:p>
-    <w:p>
-      <w:pPr>
-        <w:tabs>
-          <w:tab w:val="left" w:pos="284"/>
-        </w:tabs>
-        <w:spacing w:after="0" w:line="360" w:lineRule="auto"/>
-        <w:contextualSpacing/>
-        <w:rPr>
-          <w:i/>
-          <w:noProof/>
-          <w:lang w:eastAsia="ru-RU"/>
-        </w:rPr>
-      </w:pPr>
-    </w:p>
-    <w:p>
-      <w:pPr>
-        <w:tabs>
-          <w:tab w:val="left" w:pos="284"/>
-        </w:tabs>
-        <w:spacing w:after="0" w:line="360" w:lineRule="auto"/>
-        <w:contextualSpacing/>
-        <w:rPr>
-          <w:i/>
-          <w:noProof/>
-          <w:lang w:eastAsia="ru-RU"/>
-        </w:rPr>
-      </w:pPr>
-    </w:p>
-    <w:p>
-      <w:pPr>
-        <w:tabs>
-          <w:tab w:val="left" w:pos="284"/>
-        </w:tabs>
-        <w:spacing w:after="0" w:line="360" w:lineRule="auto"/>
-        <w:contextualSpacing/>
-        <w:rPr>
-          <w:i/>
-          <w:noProof/>
-          <w:lang w:eastAsia="ru-RU"/>
-        </w:rPr>
-      </w:pPr>
-    </w:p>
-    <w:p>
-      <w:pPr>
-        <w:tabs>
-          <w:tab w:val="left" w:pos="284"/>
-        </w:tabs>
-        <w:spacing w:after="0" w:line="360" w:lineRule="auto"/>
-        <w:contextualSpacing/>
-        <w:rPr>
-          <w:i/>
-          <w:noProof/>
-          <w:lang w:eastAsia="ru-RU"/>
-        </w:rPr>
-      </w:pPr>
-    </w:p>
-    <w:p>
-      <w:pPr>
-        <w:tabs>
-          <w:tab w:val="left" w:pos="284"/>
-        </w:tabs>
-        <w:spacing w:after="0" w:line="360" w:lineRule="auto"/>
-        <w:contextualSpacing/>
-        <w:rPr>
-          <w:i/>
-          <w:noProof/>
-          <w:lang w:eastAsia="ru-RU"/>
-        </w:rPr>
-      </w:pPr>
-    </w:p>
-    <w:p>
-      <w:pPr>
-        <w:tabs>
-          <w:tab w:val="left" w:pos="284"/>
-        </w:tabs>
-        <w:spacing w:after="0" w:line="360" w:lineRule="auto"/>
-        <w:contextualSpacing/>
-        <w:rPr>
-          <w:i/>
-          <w:noProof/>
-          <w:lang w:eastAsia="ru-RU"/>
-        </w:rPr>
-      </w:pPr>
-    </w:p>
-    <w:p>
-      <w:pPr>
-        <w:tabs>
-          <w:tab w:val="left" w:pos="284"/>
-        </w:tabs>
-        <w:spacing w:after="0" w:line="360" w:lineRule="auto"/>
-        <w:contextualSpacing/>
-        <w:rPr>
-          <w:i/>
-          <w:noProof/>
-          <w:lang w:eastAsia="ru-RU"/>
-        </w:rPr>
-      </w:pPr>
-    </w:p>
-    <w:p>
-      <w:pPr>
-        <w:tabs>
-          <w:tab w:val="left" w:pos="284"/>
-        </w:tabs>
-        <w:spacing w:after="0" w:line="360" w:lineRule="auto"/>
-        <w:contextualSpacing/>
-        <w:rPr>
-          <w:i/>
-          <w:noProof/>
-          <w:lang w:eastAsia="ru-RU"/>
-        </w:rPr>
-      </w:pPr>
-    </w:p>
-    <w:p>
-      <w:pPr>
-        <w:tabs>
-          <w:tab w:val="left" w:pos="284"/>
-        </w:tabs>
-        <w:spacing w:after="0" w:line="360" w:lineRule="auto"/>
-        <w:contextualSpacing/>
-        <w:rPr>
-          <w:i/>
-          <w:noProof/>
-          <w:lang w:eastAsia="ru-RU"/>
-        </w:rPr>
-      </w:pPr>
-    </w:p>
-    <w:p>
-      <w:pPr>
-        <w:tabs>
-          <w:tab w:val="left" w:pos="284"/>
-        </w:tabs>
-        <w:spacing w:after="0" w:line="360" w:lineRule="auto"/>
-        <w:contextualSpacing/>
-        <w:rPr>
-          <w:i/>
-          <w:noProof/>
-          <w:lang w:eastAsia="ru-RU"/>
-        </w:rPr>
-      </w:pPr>
-    </w:p>
-    <w:p>
-      <w:pPr>
-        <w:tabs>
-          <w:tab w:val="left" w:pos="284"/>
-        </w:tabs>
-        <w:spacing w:after="0" w:line="360" w:lineRule="auto"/>
-        <w:contextualSpacing/>
-        <w:rPr>
-          <w:i/>
-          <w:noProof/>
-          <w:lang w:eastAsia="ru-RU"/>
-        </w:rPr>
-      </w:pPr>
-    </w:p>
-    <w:p>
-      <w:pPr>
-        <w:tabs>
-          <w:tab w:val="left" w:pos="284"/>
-        </w:tabs>
-        <w:spacing w:after="0" w:line="360" w:lineRule="auto"/>
-        <w:contextualSpacing/>
-        <w:rPr>
-          <w:i/>
-          <w:noProof/>
-          <w:lang w:eastAsia="ru-RU"/>
-        </w:rPr>
-      </w:pPr>
-    </w:p>
-    <w:p>
-      <w:pPr>
-        <w:tabs>
-          <w:tab w:val="left" w:pos="284"/>
-        </w:tabs>
-        <w:spacing w:after="0" w:line="360" w:lineRule="auto"/>
-        <w:contextualSpacing/>
-        <w:rPr>
-          <w:i/>
-          <w:noProof/>
-          <w:lang w:eastAsia="ru-RU"/>
-        </w:rPr>
-      </w:pPr>
-    </w:p>
-    <w:p>
-      <w:pPr>
-        <w:tabs>
-          <w:tab w:val="left" w:pos="284"/>
-        </w:tabs>
-        <w:spacing w:after="0" w:line="360" w:lineRule="auto"/>
-        <w:contextualSpacing/>
-        <w:rPr>
-          <w:i/>
-          <w:noProof/>
-          <w:lang w:eastAsia="ru-RU"/>
-        </w:rPr>
-      </w:pPr>
-    </w:p>
-    <w:p>
-      <w:pPr>
-        <w:tabs>
-          <w:tab w:val="left" w:pos="284"/>
-        </w:tabs>
-        <w:spacing w:after="0" w:line="360" w:lineRule="auto"/>
-        <w:contextualSpacing/>
-        <w:rPr>
-          <w:i/>
-          <w:noProof/>
-          <w:lang w:eastAsia="ru-RU"/>
+          <w:sz w:val="10"/>
+          <w:lang w:val="en-US" w:eastAsia="ru-RU"/>
         </w:rPr>
       </w:pPr>
     </w:p>
@@ -4862,33 +4486,6 @@
           <w:sz w:val="10"/>
           <w:lang w:eastAsia="ru-RU"/>
         </w:rPr>
-        <w:tab/>
-      </w:r>
-    </w:p>
-    <w:p>
-      <w:pPr>
-        <w:tabs>
-          <w:tab w:val="left" w:pos="284"/>
-        </w:tabs>
-        <w:spacing w:after="0" w:line="360" w:lineRule="auto"/>
-        <w:contextualSpacing/>
-        <w:rPr>
-          <w:b/>
-          <w:i/>
-          <w:noProof/>
-          <w:sz w:val="10"/>
-          <w:lang w:eastAsia="ru-RU"/>
-        </w:rPr>
-      </w:pPr>
-      <w:r>
-        <w:rPr>
-          <w:b/>
-          <w:i/>
-          <w:noProof/>
-          <w:sz w:val="10"/>
-          <w:lang w:eastAsia="ru-RU"/>
-        </w:rPr>
-        <w:lastRenderedPageBreak/>
         <w:tab/>
       </w:r>
     </w:p>
@@ -5198,11 +4795,15 @@
                                 <w:p>
                                   <w:pPr>
                                     <w:rPr>
+                                      <w:b/>
+                                      <w:bCs/>
                                       <w:lang w:val="en-US"/>
                                     </w:rPr>
                                   </w:pPr>
                                   <w:r>
                                     <w:rPr>
+                                      <w:b/>
+                                      <w:bCs/>
                                       <w:lang w:val="en-US"/>
                                     </w:rPr>
                                     <w:t>{{</w:t>
@@ -5210,6 +4811,8 @@
                                   <w:proofErr w:type="spellStart"/>
                                   <w:r>
                                     <w:rPr>
+                                      <w:b/>
+                                      <w:bCs/>
                                       <w:lang w:val="en-US"/>
                                     </w:rPr>
                                     <w:t>checkDeMontazh</w:t>
@@ -5217,6 +4820,8 @@
                                   <w:proofErr w:type="spellEnd"/>
                                   <w:r>
                                     <w:rPr>
+                                      <w:b/>
+                                      <w:bCs/>
                                       <w:lang w:val="en-US"/>
                                     </w:rPr>
                                     <w:t>}}</w:t>
@@ -5250,11 +4855,15 @@
                           <w:p>
                             <w:pPr>
                               <w:rPr>
+                                <w:b/>
+                                <w:bCs/>
                                 <w:lang w:val="en-US"/>
                               </w:rPr>
                             </w:pPr>
                             <w:r>
                               <w:rPr>
+                                <w:b/>
+                                <w:bCs/>
                                 <w:lang w:val="en-US"/>
                               </w:rPr>
                               <w:t>{{</w:t>
@@ -5262,6 +4871,8 @@
                             <w:proofErr w:type="spellStart"/>
                             <w:r>
                               <w:rPr>
+                                <w:b/>
+                                <w:bCs/>
                                 <w:lang w:val="en-US"/>
                               </w:rPr>
                               <w:t>checkDeMontazh</w:t>
@@ -5269,6 +4880,8 @@
                             <w:proofErr w:type="spellEnd"/>
                             <w:r>
                               <w:rPr>
+                                <w:b/>
+                                <w:bCs/>
                                 <w:lang w:val="en-US"/>
                               </w:rPr>
                               <w:t>}}</w:t>
@@ -5337,11 +4950,15 @@
                                 <w:p>
                                   <w:pPr>
                                     <w:rPr>
+                                      <w:b/>
+                                      <w:bCs/>
                                       <w:lang w:val="en-US"/>
                                     </w:rPr>
                                   </w:pPr>
                                   <w:r>
                                     <w:rPr>
+                                      <w:b/>
+                                      <w:bCs/>
                                       <w:lang w:val="en-US"/>
                                     </w:rPr>
                                     <w:t>{{</w:t>
@@ -5349,6 +4966,8 @@
                                   <w:proofErr w:type="spellStart"/>
                                   <w:r>
                                     <w:rPr>
+                                      <w:b/>
+                                      <w:bCs/>
                                       <w:lang w:val="en-US"/>
                                     </w:rPr>
                                     <w:t>checkMontazh</w:t>
@@ -5356,6 +4975,8 @@
                                   <w:proofErr w:type="spellEnd"/>
                                   <w:r>
                                     <w:rPr>
+                                      <w:b/>
+                                      <w:bCs/>
                                       <w:lang w:val="en-US"/>
                                     </w:rPr>
                                     <w:t>}}</w:t>
@@ -5389,11 +5010,15 @@
                           <w:p>
                             <w:pPr>
                               <w:rPr>
+                                <w:b/>
+                                <w:bCs/>
                                 <w:lang w:val="en-US"/>
                               </w:rPr>
                             </w:pPr>
                             <w:r>
                               <w:rPr>
+                                <w:b/>
+                                <w:bCs/>
                                 <w:lang w:val="en-US"/>
                               </w:rPr>
                               <w:t>{{</w:t>
@@ -5401,6 +5026,8 @@
                             <w:proofErr w:type="spellStart"/>
                             <w:r>
                               <w:rPr>
+                                <w:b/>
+                                <w:bCs/>
                                 <w:lang w:val="en-US"/>
                               </w:rPr>
                               <w:t>checkMontazh</w:t>
@@ -5408,6 +5035,8 @@
                             <w:proofErr w:type="spellEnd"/>
                             <w:r>
                               <w:rPr>
+                                <w:b/>
+                                <w:bCs/>
                                 <w:lang w:val="en-US"/>
                               </w:rPr>
                               <w:t>}}</w:t>
@@ -5986,7 +5615,23 @@
                 <w:noProof/>
                 <w:lang w:val="en-US" w:eastAsia="ru-RU"/>
               </w:rPr>
-              <w:t>{{loop.index}}</w:t>
+              <w:t>{{loop.index</w:t>
+            </w:r>
+            <w:r>
+              <w:rPr>
+                <w:i/>
+                <w:noProof/>
+                <w:lang w:val="en-US" w:eastAsia="ru-RU"/>
+              </w:rPr>
+              <w:t xml:space="preserve"> +40</w:t>
+            </w:r>
+            <w:r>
+              <w:rPr>
+                <w:i/>
+                <w:noProof/>
+                <w:lang w:val="en-US" w:eastAsia="ru-RU"/>
+              </w:rPr>
+              <w:t>}}</w:t>
             </w:r>
           </w:p>
         </w:tc>
@@ -6240,17 +5885,9 @@
               <w:rPr>
                 <w:i/>
                 <w:noProof/>
-                <w:lang w:eastAsia="ru-RU"/>
-              </w:rPr>
-            </w:pPr>
-            <w:r>
-              <w:rPr>
-                <w:i/>
-                <w:noProof/>
-                <w:lang w:eastAsia="ru-RU"/>
-              </w:rPr>
-              <w:t>Монтажник СЛиП</w:t>
-            </w:r>
+                <w:lang w:val="en-US" w:eastAsia="ru-RU"/>
+              </w:rPr>
+            </w:pPr>
           </w:p>
         </w:tc>
         <w:tc>
@@ -6667,7 +6304,7 @@
                 <w:noProof/>
                 <w:lang w:val="en-US" w:eastAsia="ru-RU"/>
               </w:rPr>
-              <w:t>{{actVem}}   m3</w:t>
+              <w:t>{{actV}}   m3</w:t>
             </w:r>
           </w:p>
         </w:tc>
@@ -7033,219 +6670,11 @@
         <w:spacing w:after="0" w:line="360" w:lineRule="auto"/>
         <w:contextualSpacing/>
         <w:rPr>
+          <w:b/>
           <w:i/>
           <w:noProof/>
-          <w:lang w:eastAsia="ru-RU"/>
-        </w:rPr>
-      </w:pPr>
-    </w:p>
-    <w:p>
-      <w:pPr>
-        <w:tabs>
-          <w:tab w:val="left" w:pos="284"/>
-        </w:tabs>
-        <w:spacing w:after="0" w:line="360" w:lineRule="auto"/>
-        <w:contextualSpacing/>
-        <w:rPr>
-          <w:i/>
-          <w:noProof/>
-          <w:lang w:eastAsia="ru-RU"/>
-        </w:rPr>
-      </w:pPr>
-    </w:p>
-    <w:p>
-      <w:pPr>
-        <w:tabs>
-          <w:tab w:val="left" w:pos="284"/>
-        </w:tabs>
-        <w:spacing w:after="0" w:line="360" w:lineRule="auto"/>
-        <w:contextualSpacing/>
-        <w:rPr>
-          <w:i/>
-          <w:noProof/>
-          <w:lang w:eastAsia="ru-RU"/>
-        </w:rPr>
-      </w:pPr>
-    </w:p>
-    <w:p>
-      <w:pPr>
-        <w:tabs>
-          <w:tab w:val="left" w:pos="284"/>
-        </w:tabs>
-        <w:spacing w:after="0" w:line="360" w:lineRule="auto"/>
-        <w:contextualSpacing/>
-        <w:rPr>
-          <w:i/>
-          <w:noProof/>
-          <w:lang w:eastAsia="ru-RU"/>
-        </w:rPr>
-      </w:pPr>
-    </w:p>
-    <w:p>
-      <w:pPr>
-        <w:tabs>
-          <w:tab w:val="left" w:pos="284"/>
-        </w:tabs>
-        <w:spacing w:after="0" w:line="360" w:lineRule="auto"/>
-        <w:contextualSpacing/>
-        <w:rPr>
-          <w:i/>
-          <w:noProof/>
-          <w:lang w:eastAsia="ru-RU"/>
-        </w:rPr>
-      </w:pPr>
-    </w:p>
-    <w:p>
-      <w:pPr>
-        <w:tabs>
-          <w:tab w:val="left" w:pos="284"/>
-        </w:tabs>
-        <w:spacing w:after="0" w:line="360" w:lineRule="auto"/>
-        <w:contextualSpacing/>
-        <w:rPr>
-          <w:i/>
-          <w:noProof/>
-          <w:lang w:eastAsia="ru-RU"/>
-        </w:rPr>
-      </w:pPr>
-    </w:p>
-    <w:p>
-      <w:pPr>
-        <w:tabs>
-          <w:tab w:val="left" w:pos="284"/>
-        </w:tabs>
-        <w:spacing w:after="0" w:line="360" w:lineRule="auto"/>
-        <w:contextualSpacing/>
-        <w:rPr>
-          <w:i/>
-          <w:noProof/>
-          <w:lang w:eastAsia="ru-RU"/>
-        </w:rPr>
-      </w:pPr>
-    </w:p>
-    <w:p>
-      <w:pPr>
-        <w:tabs>
-          <w:tab w:val="left" w:pos="284"/>
-        </w:tabs>
-        <w:spacing w:after="0" w:line="360" w:lineRule="auto"/>
-        <w:contextualSpacing/>
-        <w:rPr>
-          <w:i/>
-          <w:noProof/>
-          <w:lang w:eastAsia="ru-RU"/>
-        </w:rPr>
-      </w:pPr>
-    </w:p>
-    <w:p>
-      <w:pPr>
-        <w:tabs>
-          <w:tab w:val="left" w:pos="284"/>
-        </w:tabs>
-        <w:spacing w:after="0" w:line="360" w:lineRule="auto"/>
-        <w:contextualSpacing/>
-        <w:rPr>
-          <w:i/>
-          <w:noProof/>
-          <w:lang w:eastAsia="ru-RU"/>
-        </w:rPr>
-      </w:pPr>
-    </w:p>
-    <w:p>
-      <w:pPr>
-        <w:tabs>
-          <w:tab w:val="left" w:pos="284"/>
-        </w:tabs>
-        <w:spacing w:after="0" w:line="360" w:lineRule="auto"/>
-        <w:contextualSpacing/>
-        <w:rPr>
-          <w:i/>
-          <w:noProof/>
-          <w:lang w:eastAsia="ru-RU"/>
-        </w:rPr>
-      </w:pPr>
-    </w:p>
-    <w:p>
-      <w:pPr>
-        <w:tabs>
-          <w:tab w:val="left" w:pos="284"/>
-        </w:tabs>
-        <w:spacing w:after="0" w:line="360" w:lineRule="auto"/>
-        <w:contextualSpacing/>
-        <w:rPr>
-          <w:i/>
-          <w:noProof/>
-          <w:lang w:eastAsia="ru-RU"/>
-        </w:rPr>
-      </w:pPr>
-    </w:p>
-    <w:p>
-      <w:pPr>
-        <w:tabs>
-          <w:tab w:val="left" w:pos="284"/>
-        </w:tabs>
-        <w:spacing w:after="0" w:line="360" w:lineRule="auto"/>
-        <w:contextualSpacing/>
-        <w:rPr>
-          <w:i/>
-          <w:noProof/>
-          <w:lang w:eastAsia="ru-RU"/>
-        </w:rPr>
-      </w:pPr>
-    </w:p>
-    <w:p>
-      <w:pPr>
-        <w:tabs>
-          <w:tab w:val="left" w:pos="284"/>
-        </w:tabs>
-        <w:spacing w:after="0" w:line="360" w:lineRule="auto"/>
-        <w:contextualSpacing/>
-        <w:rPr>
-          <w:i/>
-          <w:noProof/>
-          <w:lang w:eastAsia="ru-RU"/>
-        </w:rPr>
-      </w:pPr>
-    </w:p>
-    <w:p>
-      <w:pPr>
-        <w:tabs>
-          <w:tab w:val="left" w:pos="284"/>
-        </w:tabs>
-        <w:spacing w:after="0" w:line="360" w:lineRule="auto"/>
-        <w:contextualSpacing/>
-        <w:rPr>
-          <w:i/>
-          <w:noProof/>
-          <w:lang w:eastAsia="ru-RU"/>
-        </w:rPr>
-      </w:pPr>
-    </w:p>
-    <w:p>
-      <w:pPr>
-        <w:tabs>
-          <w:tab w:val="left" w:pos="284"/>
-        </w:tabs>
-        <w:spacing w:after="0" w:line="360" w:lineRule="auto"/>
-        <w:contextualSpacing/>
-        <w:rPr>
-          <w:i/>
-          <w:noProof/>
-          <w:lang w:eastAsia="ru-RU"/>
-        </w:rPr>
-      </w:pPr>
-    </w:p>
-    <w:p>
-      <w:pPr>
-        <w:tabs>
-          <w:tab w:val="left" w:pos="284"/>
-        </w:tabs>
-        <w:spacing w:after="0" w:line="360" w:lineRule="auto"/>
-        <w:contextualSpacing/>
-        <w:rPr>
-          <w:i/>
-          <w:noProof/>
-          <w:lang w:eastAsia="ru-RU"/>
+          <w:sz w:val="10"/>
+          <w:lang w:val="en-US" w:eastAsia="ru-RU"/>
         </w:rPr>
       </w:pPr>
     </w:p>
@@ -7272,33 +6701,6 @@
           <w:sz w:val="10"/>
           <w:lang w:eastAsia="ru-RU"/>
         </w:rPr>
-        <w:tab/>
-      </w:r>
-    </w:p>
-    <w:p>
-      <w:pPr>
-        <w:tabs>
-          <w:tab w:val="left" w:pos="284"/>
-        </w:tabs>
-        <w:spacing w:after="0" w:line="360" w:lineRule="auto"/>
-        <w:contextualSpacing/>
-        <w:rPr>
-          <w:b/>
-          <w:i/>
-          <w:noProof/>
-          <w:sz w:val="10"/>
-          <w:lang w:eastAsia="ru-RU"/>
-        </w:rPr>
-      </w:pPr>
-      <w:r>
-        <w:rPr>
-          <w:b/>
-          <w:i/>
-          <w:noProof/>
-          <w:sz w:val="10"/>
-          <w:lang w:eastAsia="ru-RU"/>
-        </w:rPr>
-        <w:lastRenderedPageBreak/>
         <w:tab/>
       </w:r>
     </w:p>
@@ -7608,11 +7010,15 @@
                                 <w:p>
                                   <w:pPr>
                                     <w:rPr>
+                                      <w:b/>
+                                      <w:bCs/>
                                       <w:lang w:val="en-US"/>
                                     </w:rPr>
                                   </w:pPr>
                                   <w:r>
                                     <w:rPr>
+                                      <w:b/>
+                                      <w:bCs/>
                                       <w:lang w:val="en-US"/>
                                     </w:rPr>
                                     <w:t>{{</w:t>
@@ -7620,6 +7026,8 @@
                                   <w:proofErr w:type="spellStart"/>
                                   <w:r>
                                     <w:rPr>
+                                      <w:b/>
+                                      <w:bCs/>
                                       <w:lang w:val="en-US"/>
                                     </w:rPr>
                                     <w:t>checkDeMontazh</w:t>
@@ -7627,6 +7035,8 @@
                                   <w:proofErr w:type="spellEnd"/>
                                   <w:r>
                                     <w:rPr>
+                                      <w:b/>
+                                      <w:bCs/>
                                       <w:lang w:val="en-US"/>
                                     </w:rPr>
                                     <w:t>}}</w:t>
@@ -7660,11 +7070,15 @@
                           <w:p>
                             <w:pPr>
                               <w:rPr>
+                                <w:b/>
+                                <w:bCs/>
                                 <w:lang w:val="en-US"/>
                               </w:rPr>
                             </w:pPr>
                             <w:r>
                               <w:rPr>
+                                <w:b/>
+                                <w:bCs/>
                                 <w:lang w:val="en-US"/>
                               </w:rPr>
                               <w:t>{{</w:t>
@@ -7672,6 +7086,8 @@
                             <w:proofErr w:type="spellStart"/>
                             <w:r>
                               <w:rPr>
+                                <w:b/>
+                                <w:bCs/>
                                 <w:lang w:val="en-US"/>
                               </w:rPr>
                               <w:t>checkDeMontazh</w:t>
@@ -7679,6 +7095,8 @@
                             <w:proofErr w:type="spellEnd"/>
                             <w:r>
                               <w:rPr>
+                                <w:b/>
+                                <w:bCs/>
                                 <w:lang w:val="en-US"/>
                               </w:rPr>
                               <w:t>}}</w:t>
@@ -7747,11 +7165,15 @@
                                 <w:p>
                                   <w:pPr>
                                     <w:rPr>
+                                      <w:b/>
+                                      <w:bCs/>
                                       <w:lang w:val="en-US"/>
                                     </w:rPr>
                                   </w:pPr>
                                   <w:r>
                                     <w:rPr>
+                                      <w:b/>
+                                      <w:bCs/>
                                       <w:lang w:val="en-US"/>
                                     </w:rPr>
                                     <w:t>{{</w:t>
@@ -7759,6 +7181,8 @@
                                   <w:proofErr w:type="spellStart"/>
                                   <w:r>
                                     <w:rPr>
+                                      <w:b/>
+                                      <w:bCs/>
                                       <w:lang w:val="en-US"/>
                                     </w:rPr>
                                     <w:t>checkMontazh</w:t>
@@ -7766,6 +7190,8 @@
                                   <w:proofErr w:type="spellEnd"/>
                                   <w:r>
                                     <w:rPr>
+                                      <w:b/>
+                                      <w:bCs/>
                                       <w:lang w:val="en-US"/>
                                     </w:rPr>
                                     <w:t>}}</w:t>
@@ -7799,11 +7225,15 @@
                           <w:p>
                             <w:pPr>
                               <w:rPr>
+                                <w:b/>
+                                <w:bCs/>
                                 <w:lang w:val="en-US"/>
                               </w:rPr>
                             </w:pPr>
                             <w:r>
                               <w:rPr>
+                                <w:b/>
+                                <w:bCs/>
                                 <w:lang w:val="en-US"/>
                               </w:rPr>
                               <w:t>{{</w:t>
@@ -7811,6 +7241,8 @@
                             <w:proofErr w:type="spellStart"/>
                             <w:r>
                               <w:rPr>
+                                <w:b/>
+                                <w:bCs/>
                                 <w:lang w:val="en-US"/>
                               </w:rPr>
                               <w:t>checkMontazh</w:t>
@@ -7818,6 +7250,8 @@
                             <w:proofErr w:type="spellEnd"/>
                             <w:r>
                               <w:rPr>
+                                <w:b/>
+                                <w:bCs/>
                                 <w:lang w:val="en-US"/>
                               </w:rPr>
                               <w:t>}}</w:t>
@@ -8120,6 +7554,7 @@
                 <w:sz w:val="14"/>
                 <w:lang w:eastAsia="ru-RU"/>
               </w:rPr>
+              <w:lastRenderedPageBreak/>
               <w:t>Номер по порядку</w:t>
             </w:r>
           </w:p>
@@ -8396,7 +7831,23 @@
                 <w:noProof/>
                 <w:lang w:val="en-US" w:eastAsia="ru-RU"/>
               </w:rPr>
-              <w:t>{{loop.index}}</w:t>
+              <w:t>{{loop.index</w:t>
+            </w:r>
+            <w:r>
+              <w:rPr>
+                <w:i/>
+                <w:noProof/>
+                <w:lang w:val="en-US" w:eastAsia="ru-RU"/>
+              </w:rPr>
+              <w:t>+60</w:t>
+            </w:r>
+            <w:r>
+              <w:rPr>
+                <w:i/>
+                <w:noProof/>
+                <w:lang w:val="en-US" w:eastAsia="ru-RU"/>
+              </w:rPr>
+              <w:t>}}</w:t>
             </w:r>
           </w:p>
         </w:tc>
@@ -8670,17 +8121,9 @@
               <w:rPr>
                 <w:i/>
                 <w:noProof/>
-                <w:lang w:eastAsia="ru-RU"/>
-              </w:rPr>
-            </w:pPr>
-            <w:r>
-              <w:rPr>
-                <w:i/>
-                <w:noProof/>
-                <w:lang w:eastAsia="ru-RU"/>
-              </w:rPr>
-              <w:t>Монтажник СЛиП</w:t>
-            </w:r>
+                <w:lang w:val="en-US" w:eastAsia="ru-RU"/>
+              </w:rPr>
+            </w:pPr>
           </w:p>
         </w:tc>
         <w:tc>
@@ -9097,7 +8540,7 @@
                 <w:noProof/>
                 <w:lang w:val="en-US" w:eastAsia="ru-RU"/>
               </w:rPr>
-              <w:t>{{actVem}}   m3</w:t>
+              <w:t>{{actV}}   m3</w:t>
             </w:r>
           </w:p>
         </w:tc>
@@ -9463,247 +8906,13 @@
         <w:spacing w:after="0" w:line="360" w:lineRule="auto"/>
         <w:contextualSpacing/>
         <w:rPr>
-          <w:i/>
-          <w:noProof/>
-          <w:lang w:eastAsia="ru-RU"/>
-        </w:rPr>
-      </w:pPr>
-    </w:p>
-    <w:p>
-      <w:pPr>
-        <w:tabs>
-          <w:tab w:val="left" w:pos="284"/>
-        </w:tabs>
-        <w:spacing w:after="0" w:line="360" w:lineRule="auto"/>
-        <w:contextualSpacing/>
-        <w:rPr>
-          <w:i/>
-          <w:noProof/>
-          <w:lang w:eastAsia="ru-RU"/>
-        </w:rPr>
-      </w:pPr>
-    </w:p>
-    <w:p>
-      <w:pPr>
-        <w:tabs>
-          <w:tab w:val="left" w:pos="284"/>
-        </w:tabs>
-        <w:spacing w:after="0" w:line="360" w:lineRule="auto"/>
-        <w:contextualSpacing/>
-        <w:rPr>
-          <w:i/>
-          <w:noProof/>
-          <w:lang w:eastAsia="ru-RU"/>
-        </w:rPr>
-      </w:pPr>
-    </w:p>
-    <w:p>
-      <w:pPr>
-        <w:tabs>
-          <w:tab w:val="left" w:pos="284"/>
-        </w:tabs>
-        <w:spacing w:after="0" w:line="360" w:lineRule="auto"/>
-        <w:contextualSpacing/>
-        <w:rPr>
-          <w:i/>
-          <w:noProof/>
-          <w:lang w:eastAsia="ru-RU"/>
-        </w:rPr>
-      </w:pPr>
-    </w:p>
-    <w:p>
-      <w:pPr>
-        <w:tabs>
-          <w:tab w:val="left" w:pos="284"/>
-        </w:tabs>
-        <w:spacing w:after="0" w:line="360" w:lineRule="auto"/>
-        <w:contextualSpacing/>
-        <w:rPr>
-          <w:i/>
-          <w:noProof/>
-          <w:lang w:eastAsia="ru-RU"/>
-        </w:rPr>
-      </w:pPr>
-    </w:p>
-    <w:p>
-      <w:pPr>
-        <w:tabs>
-          <w:tab w:val="left" w:pos="284"/>
-        </w:tabs>
-        <w:spacing w:after="0" w:line="360" w:lineRule="auto"/>
-        <w:contextualSpacing/>
-        <w:rPr>
-          <w:i/>
-          <w:noProof/>
-          <w:lang w:eastAsia="ru-RU"/>
-        </w:rPr>
-      </w:pPr>
-    </w:p>
-    <w:p>
-      <w:pPr>
-        <w:tabs>
-          <w:tab w:val="left" w:pos="284"/>
-        </w:tabs>
-        <w:spacing w:after="0" w:line="360" w:lineRule="auto"/>
-        <w:contextualSpacing/>
-        <w:rPr>
-          <w:i/>
-          <w:noProof/>
-          <w:lang w:eastAsia="ru-RU"/>
-        </w:rPr>
-      </w:pPr>
-    </w:p>
-    <w:p>
-      <w:pPr>
-        <w:tabs>
-          <w:tab w:val="left" w:pos="284"/>
-        </w:tabs>
-        <w:spacing w:after="0" w:line="360" w:lineRule="auto"/>
-        <w:contextualSpacing/>
-        <w:rPr>
-          <w:i/>
-          <w:noProof/>
-          <w:lang w:eastAsia="ru-RU"/>
-        </w:rPr>
-      </w:pPr>
-    </w:p>
-    <w:p>
-      <w:pPr>
-        <w:tabs>
-          <w:tab w:val="left" w:pos="284"/>
-        </w:tabs>
-        <w:spacing w:after="0" w:line="360" w:lineRule="auto"/>
-        <w:contextualSpacing/>
-        <w:rPr>
-          <w:i/>
-          <w:noProof/>
-          <w:lang w:eastAsia="ru-RU"/>
-        </w:rPr>
-      </w:pPr>
-    </w:p>
-    <w:p>
-      <w:pPr>
-        <w:tabs>
-          <w:tab w:val="left" w:pos="284"/>
-        </w:tabs>
-        <w:spacing w:after="0" w:line="360" w:lineRule="auto"/>
-        <w:contextualSpacing/>
-        <w:rPr>
-          <w:i/>
-          <w:noProof/>
-          <w:lang w:eastAsia="ru-RU"/>
-        </w:rPr>
-      </w:pPr>
-    </w:p>
-    <w:p>
-      <w:pPr>
-        <w:tabs>
-          <w:tab w:val="left" w:pos="284"/>
-        </w:tabs>
-        <w:spacing w:after="0" w:line="360" w:lineRule="auto"/>
-        <w:contextualSpacing/>
-        <w:rPr>
-          <w:i/>
-          <w:noProof/>
-          <w:lang w:eastAsia="ru-RU"/>
-        </w:rPr>
-      </w:pPr>
-    </w:p>
-    <w:p>
-      <w:pPr>
-        <w:tabs>
-          <w:tab w:val="left" w:pos="284"/>
-        </w:tabs>
-        <w:spacing w:after="0" w:line="360" w:lineRule="auto"/>
-        <w:contextualSpacing/>
-        <w:rPr>
-          <w:i/>
-          <w:noProof/>
-          <w:lang w:eastAsia="ru-RU"/>
-        </w:rPr>
-      </w:pPr>
-    </w:p>
-    <w:p>
-      <w:pPr>
-        <w:tabs>
-          <w:tab w:val="left" w:pos="284"/>
-        </w:tabs>
-        <w:spacing w:after="0" w:line="360" w:lineRule="auto"/>
-        <w:contextualSpacing/>
-        <w:rPr>
-          <w:i/>
-          <w:noProof/>
-          <w:lang w:eastAsia="ru-RU"/>
-        </w:rPr>
-      </w:pPr>
-    </w:p>
-    <w:p>
-      <w:pPr>
-        <w:tabs>
-          <w:tab w:val="left" w:pos="284"/>
-        </w:tabs>
-        <w:spacing w:after="0" w:line="360" w:lineRule="auto"/>
-        <w:contextualSpacing/>
-        <w:rPr>
-          <w:i/>
-          <w:noProof/>
-          <w:lang w:eastAsia="ru-RU"/>
-        </w:rPr>
-      </w:pPr>
-    </w:p>
-    <w:p>
-      <w:pPr>
-        <w:tabs>
-          <w:tab w:val="left" w:pos="284"/>
-        </w:tabs>
-        <w:spacing w:after="0" w:line="360" w:lineRule="auto"/>
-        <w:contextualSpacing/>
-        <w:rPr>
-          <w:i/>
-          <w:noProof/>
-          <w:lang w:eastAsia="ru-RU"/>
-        </w:rPr>
-      </w:pPr>
-    </w:p>
-    <w:p>
-      <w:pPr>
-        <w:tabs>
-          <w:tab w:val="left" w:pos="284"/>
-        </w:tabs>
-        <w:spacing w:after="0" w:line="360" w:lineRule="auto"/>
-        <w:contextualSpacing/>
-        <w:rPr>
-          <w:i/>
-          <w:noProof/>
-          <w:lang w:eastAsia="ru-RU"/>
-        </w:rPr>
-      </w:pPr>
-    </w:p>
-    <w:p>
-      <w:pPr>
-        <w:tabs>
-          <w:tab w:val="left" w:pos="284"/>
-        </w:tabs>
-        <w:spacing w:after="0" w:line="360" w:lineRule="auto"/>
-        <w:contextualSpacing/>
-        <w:rPr>
           <w:b/>
           <w:i/>
           <w:noProof/>
           <w:sz w:val="10"/>
-          <w:lang w:eastAsia="ru-RU"/>
+          <w:lang w:val="en-US" w:eastAsia="ru-RU"/>
         </w:rPr>
       </w:pPr>
-      <w:r>
-        <w:rPr>
-          <w:b/>
-          <w:i/>
-          <w:noProof/>
-          <w:sz w:val="10"/>
-          <w:lang w:eastAsia="ru-RU"/>
-        </w:rPr>
-        <w:tab/>
-      </w:r>
     </w:p>
     <w:sectPr>
       <w:headerReference w:type="default" r:id="rId8"/>
@@ -9846,14 +9055,14 @@
         <v:path o:extrusionok="f" gradientshapeok="t" o:connecttype="rect"/>
         <o:lock v:ext="edit" aspectratio="t"/>
       </v:shapetype>
-      <v:shape id="_x0000_i1084" type="#_x0000_t75" style="width:19.5pt;height:11.25pt;visibility:visible;mso-wrap-style:square" o:bullet="t">
+      <v:shape id="_x0000_i1080" type="#_x0000_t75" style="width:19.5pt;height:11.25pt;visibility:visible;mso-wrap-style:square" o:bullet="t">
         <v:imagedata r:id="rId1" o:title=""/>
       </v:shape>
     </w:pict>
   </w:numPicBullet>
   <w:numPicBullet w:numPicBulletId="1">
     <w:pict>
-      <v:shape id="_x0000_i1085" type="#_x0000_t75" style="width:27pt;height:20.25pt;visibility:visible;mso-wrap-style:square" o:bullet="t">
+      <v:shape id="_x0000_i1081" type="#_x0000_t75" style="width:27pt;height:20.25pt;visibility:visible;mso-wrap-style:square" o:bullet="t">
         <v:imagedata r:id="rId2" o:title=""/>
       </v:shape>
     </w:pict>

</xml_diff>